<commit_message>
Add title page + per-chapter page breaks to PROMPTS_CHEATSHEET.docx
Matches the PREREQS treatment for consistency:
- Title page: BGU logo, course name, "Prompts Cheat Sheet" subtitle, lecturer
- Phases promoted from h2 to h1 (sub-steps h3->h2) so "chapter = h1"
  matches PREREQS and the shared reference.docx applies pageBreakBefore
  to each phase
- Old doc-title line folded into the title page; intro wrapped in a
  "Before You Start" chapter so it gets its own page
- Generated with --reference-doc=reference.docx --standalone

Regeneration:
  pandoc PROMPTS_CHEATSHEET.md -o PROMPTS_CHEATSHEET.docx --reference-doc=reference.docx --standalone

Co-Authored-By: Claude Opus 4.7 (1M context) <noreply@anthropic.com>
</commit_message>
<xml_diff>
--- a/PROMPTS_CHEATSHEET.docx
+++ b/PROMPTS_CHEATSHEET.docx
@@ -2,39 +2,84 @@
 <file path=word/document.xml><?xml version="1.0" encoding="utf-8"?>
 <w:document xmlns:w="http://schemas.openxmlformats.org/wordprocessingml/2006/main" xmlns:m="http://schemas.openxmlformats.org/officeDocument/2006/math" xmlns:r="http://schemas.openxmlformats.org/officeDocument/2006/relationships" xmlns:o="urn:schemas-microsoft-com:office:office" xmlns:v="urn:schemas-microsoft-com:vml" xmlns:w10="urn:schemas-microsoft-com:office:word" xmlns:a="http://schemas.openxmlformats.org/drawingml/2006/main" xmlns:pic="http://schemas.openxmlformats.org/drawingml/2006/picture" xmlns:wp="http://schemas.openxmlformats.org/drawingml/2006/wordprocessingDrawing">
   <w:body>
-    <w:sdt>
-      <w:sdtPr>
-        <w:docPartObj>
-          <w:docPartGallery w:val="Table of Contents"/>
-          <w:docPartUnique/>
-        </w:docPartObj>
-      </w:sdtPr>
-      <w:sdtContent>
-        <w:p>
-          <w:pPr>
-            <w:pStyle w:val="TOCHeading"/>
-          </w:pPr>
-          <w:r>
-            <w:t xml:space="preserve">Table of Contents</w:t>
-          </w:r>
-        </w:p>
-        <w:p>
-          <w:r>
-            <w:fldChar w:fldCharType="begin" w:dirty="true"/>
-            <w:instrText xml:space="preserve">TOC \o "1-3" \h \z \u</w:instrText>
-            <w:fldChar w:fldCharType="separate"/>
-            <w:fldChar w:fldCharType="end"/>
-          </w:r>
-        </w:p>
-      </w:sdtContent>
-    </w:sdt>
-    <w:bookmarkStart w:id="36" w:name="X72b97b9ef2279d6af2e0950ee4eebce50bed22e"/>
+    <w:p>
+      <w:pPr>
+        <w:pStyle w:val="Centered"/>
+      </w:pPr>
+      <w:r>
+        <w:drawing>
+          <wp:inline>
+            <wp:extent cx="2926080" cy="883743"/>
+            <wp:effectExtent b="0" l="0" r="0" t="0"/>
+            <wp:docPr descr="" title="" id="10" name="Picture"/>
+            <a:graphic>
+              <a:graphicData uri="http://schemas.openxmlformats.org/drawingml/2006/picture">
+                <pic:pic>
+                  <pic:nvPicPr>
+                    <pic:cNvPr descr="bgu-logo.png" id="11" name="Picture"/>
+                    <pic:cNvPicPr>
+                      <a:picLocks noChangeArrowheads="1" noChangeAspect="1"/>
+                    </pic:cNvPicPr>
+                  </pic:nvPicPr>
+                  <pic:blipFill>
+                    <a:blip r:embed="rId9"/>
+                    <a:stretch>
+                      <a:fillRect/>
+                    </a:stretch>
+                  </pic:blipFill>
+                  <pic:spPr bwMode="auto">
+                    <a:xfrm>
+                      <a:off x="0" y="0"/>
+                      <a:ext cx="2926080" cy="883743"/>
+                    </a:xfrm>
+                    <a:prstGeom prst="rect">
+                      <a:avLst/>
+                    </a:prstGeom>
+                    <a:noFill/>
+                    <a:ln w="9525">
+                      <a:noFill/>
+                      <a:headEnd/>
+                      <a:tailEnd/>
+                    </a:ln>
+                  </pic:spPr>
+                </pic:pic>
+              </a:graphicData>
+            </a:graphic>
+          </wp:inline>
+        </w:drawing>
+      </w:r>
+    </w:p>
+    <w:p>
+      <w:pPr>
+        <w:pStyle w:val="Title"/>
+      </w:pPr>
+      <w:r>
+        <w:t xml:space="preserve">Software Analysis and Design</w:t>
+      </w:r>
+    </w:p>
+    <w:p>
+      <w:pPr>
+        <w:pStyle w:val="Subtitle"/>
+      </w:pPr>
+      <w:r>
+        <w:t xml:space="preserve">Prompts Cheat Sheet — In-Class Copy-Paste Guide</w:t>
+      </w:r>
+    </w:p>
+    <w:p>
+      <w:pPr>
+        <w:pStyle w:val="Author"/>
+      </w:pPr>
+      <w:r>
+        <w:t xml:space="preserve">Lecturer: David Codish</w:t>
+      </w:r>
+    </w:p>
+    <w:bookmarkStart w:id="12" w:name="before-you-start"/>
     <w:p>
       <w:pPr>
         <w:pStyle w:val="Heading1"/>
       </w:pPr>
       <w:r>
-        <w:t xml:space="preserve">Prompts Cheat Sheet — In-Class Copy-Paste Guide</w:t>
+        <w:t xml:space="preserve">Before You Start</w:t>
       </w:r>
     </w:p>
     <w:p>
@@ -216,17 +261,11 @@
         <w:t xml:space="preserve"># lists local SQL Server instances</w:t>
       </w:r>
     </w:p>
-    <w:p>
-      <w:r>
-        <w:pict>
-          <v:rect style="width:0;height:1.5pt" o:hralign="center" o:hrstd="t" o:hr="t"/>
-        </w:pict>
-      </w:r>
-    </w:p>
-    <w:bookmarkStart w:id="9" w:name="phase-1-project-setup"/>
-    <w:p>
-      <w:pPr>
-        <w:pStyle w:val="Heading2"/>
+    <w:bookmarkEnd w:id="12"/>
+    <w:bookmarkStart w:id="13" w:name="phase-1-project-setup"/>
+    <w:p>
+      <w:pPr>
+        <w:pStyle w:val="Heading1"/>
       </w:pPr>
       <w:r>
         <w:t xml:space="preserve">Phase 1 — Project Setup</w:t>
@@ -655,11 +694,11 @@
         </w:pict>
       </w:r>
     </w:p>
-    <w:bookmarkEnd w:id="9"/>
-    <w:bookmarkStart w:id="10" w:name="X08e7dc26b1a12a0c2ea1778c6915a938f83c010"/>
-    <w:p>
-      <w:pPr>
-        <w:pStyle w:val="Heading2"/>
+    <w:bookmarkEnd w:id="13"/>
+    <w:bookmarkStart w:id="14" w:name="X08e7dc26b1a12a0c2ea1778c6915a938f83c010"/>
+    <w:p>
+      <w:pPr>
+        <w:pStyle w:val="Heading1"/>
       </w:pPr>
       <w:r>
         <w:t xml:space="preserve">Phase 2 — Extract Analysis Into Structured Markdown</w:t>
@@ -1013,11 +1052,11 @@
         </w:pict>
       </w:r>
     </w:p>
-    <w:bookmarkEnd w:id="10"/>
-    <w:bookmarkStart w:id="11" w:name="phase-3-generate-your-projects-claude.md"/>
-    <w:p>
-      <w:pPr>
-        <w:pStyle w:val="Heading2"/>
+    <w:bookmarkEnd w:id="14"/>
+    <w:bookmarkStart w:id="15" w:name="phase-3-generate-your-projects-claude.md"/>
+    <w:p>
+      <w:pPr>
+        <w:pStyle w:val="Heading1"/>
       </w:pPr>
       <w:r>
         <w:t xml:space="preserve">Phase 3 — Generate Your Project’s CLAUDE.md</w:t>
@@ -1182,22 +1221,22 @@
         </w:pict>
       </w:r>
     </w:p>
-    <w:bookmarkEnd w:id="11"/>
-    <w:bookmarkStart w:id="18" w:name="X223204e5c4972044ec6e35e58d9b17e1ad3d801"/>
+    <w:bookmarkEnd w:id="15"/>
+    <w:bookmarkStart w:id="22" w:name="X223204e5c4972044ec6e35e58d9b17e1ad3d801"/>
+    <w:p>
+      <w:pPr>
+        <w:pStyle w:val="Heading1"/>
+      </w:pPr>
+      <w:r>
+        <w:t xml:space="preserve">Phase 4 — Database Schema + Stored Procedures</w:t>
+      </w:r>
+    </w:p>
+    <w:bookmarkStart w:id="16" w:name="create-the-project-database"/>
     <w:p>
       <w:pPr>
         <w:pStyle w:val="Heading2"/>
       </w:pPr>
       <w:r>
-        <w:t xml:space="preserve">Phase 4 — Database Schema + Stored Procedures</w:t>
-      </w:r>
-    </w:p>
-    <w:bookmarkStart w:id="12" w:name="create-the-project-database"/>
-    <w:p>
-      <w:pPr>
-        <w:pStyle w:val="Heading3"/>
-      </w:pPr>
-      <w:r>
         <w:t xml:space="preserve">4.0 — Create the project database</w:t>
       </w:r>
     </w:p>
@@ -1280,11 +1319,11 @@
         <w:t xml:space="preserve">documenting the DB name and this rule.</w:t>
       </w:r>
     </w:p>
-    <w:bookmarkEnd w:id="12"/>
-    <w:bookmarkStart w:id="13" w:name="generate-the-schema"/>
-    <w:p>
-      <w:pPr>
-        <w:pStyle w:val="Heading3"/>
+    <w:bookmarkEnd w:id="16"/>
+    <w:bookmarkStart w:id="17" w:name="generate-the-schema"/>
+    <w:p>
+      <w:pPr>
+        <w:pStyle w:val="Heading2"/>
       </w:pPr>
       <w:r>
         <w:t xml:space="preserve">4.1 — Generate the schema</w:t>
@@ -1675,21 +1714,21 @@
         <w:t xml:space="preserve">comment. Write the file but do not run it yet.</w:t>
       </w:r>
     </w:p>
-    <w:bookmarkEnd w:id="13"/>
-    <w:bookmarkStart w:id="14" w:name="Xbc7c6f71d0350f115609376f4e851ff16c53e41"/>
-    <w:p>
-      <w:pPr>
-        <w:pStyle w:val="Heading3"/>
+    <w:bookmarkEnd w:id="17"/>
+    <w:bookmarkStart w:id="18" w:name="Xbc7c6f71d0350f115609376f4e851ff16c53e41"/>
+    <w:p>
+      <w:pPr>
+        <w:pStyle w:val="Heading2"/>
       </w:pPr>
       <w:r>
         <w:t xml:space="preserve">4.2 — Review the schema (manual, against the class diagram)</w:t>
       </w:r>
     </w:p>
-    <w:bookmarkEnd w:id="14"/>
-    <w:bookmarkStart w:id="15" w:name="execute-the-schema"/>
-    <w:p>
-      <w:pPr>
-        <w:pStyle w:val="Heading3"/>
+    <w:bookmarkEnd w:id="18"/>
+    <w:bookmarkStart w:id="19" w:name="execute-the-schema"/>
+    <w:p>
+      <w:pPr>
+        <w:pStyle w:val="Heading2"/>
       </w:pPr>
       <w:r>
         <w:t xml:space="preserve">4.3 — Execute the schema</w:t>
@@ -1718,11 +1757,11 @@
         <w:t xml:space="preserve">against the database via the mssql MCP tool. Execute as one batch. If it fails, tell me which statement failed and the error — don’t silently retry. After success, use list_tables to confirm every table exists.</w:t>
       </w:r>
     </w:p>
-    <w:bookmarkEnd w:id="15"/>
-    <w:bookmarkStart w:id="16" w:name="generate-stored-procedures"/>
-    <w:p>
-      <w:pPr>
-        <w:pStyle w:val="Heading3"/>
+    <w:bookmarkEnd w:id="19"/>
+    <w:bookmarkStart w:id="20" w:name="generate-stored-procedures"/>
+    <w:p>
+      <w:pPr>
+        <w:pStyle w:val="Heading2"/>
       </w:pPr>
       <w:r>
         <w:t xml:space="preserve">4.4 — Generate stored procedures</w:t>
@@ -1924,11 +1963,11 @@
         <w:t xml:space="preserve">via the mssql MCP tool.</w:t>
       </w:r>
     </w:p>
-    <w:bookmarkEnd w:id="16"/>
-    <w:bookmarkStart w:id="17" w:name="spot-check-one-entity-end-to-end"/>
-    <w:p>
-      <w:pPr>
-        <w:pStyle w:val="Heading3"/>
+    <w:bookmarkEnd w:id="20"/>
+    <w:bookmarkStart w:id="21" w:name="spot-check-one-entity-end-to-end"/>
+    <w:p>
+      <w:pPr>
+        <w:pStyle w:val="Heading2"/>
       </w:pPr>
       <w:r>
         <w:t xml:space="preserve">4.5 — Spot-check one entity end-to-end</w:t>
@@ -1973,12 +2012,12 @@
         </w:pict>
       </w:r>
     </w:p>
-    <w:bookmarkEnd w:id="17"/>
-    <w:bookmarkEnd w:id="18"/>
-    <w:bookmarkStart w:id="19" w:name="phase-4.5-seed-test-data"/>
-    <w:p>
-      <w:pPr>
-        <w:pStyle w:val="Heading2"/>
+    <w:bookmarkEnd w:id="21"/>
+    <w:bookmarkEnd w:id="22"/>
+    <w:bookmarkStart w:id="23" w:name="phase-4.5-seed-test-data"/>
+    <w:p>
+      <w:pPr>
+        <w:pStyle w:val="Heading1"/>
       </w:pPr>
       <w:r>
         <w:t xml:space="preserve">Phase 4.5 — Seed Test Data</w:t>
@@ -2113,22 +2152,22 @@
         </w:pict>
       </w:r>
     </w:p>
-    <w:bookmarkEnd w:id="19"/>
-    <w:bookmarkStart w:id="27" w:name="Xde32ff6c7999e2eee377931391c423599abf67f"/>
+    <w:bookmarkEnd w:id="23"/>
+    <w:bookmarkStart w:id="31" w:name="Xde32ff6c7999e2eee377931391c423599abf67f"/>
+    <w:p>
+      <w:pPr>
+        <w:pStyle w:val="Heading1"/>
+      </w:pPr>
+      <w:r>
+        <w:t xml:space="preserve">Phase 5 — C# Project Scaffold and First Runnable Panel</w:t>
+      </w:r>
+    </w:p>
+    <w:bookmarkStart w:id="24" w:name="scaffold"/>
     <w:p>
       <w:pPr>
         <w:pStyle w:val="Heading2"/>
       </w:pPr>
       <w:r>
-        <w:t xml:space="preserve">Phase 5 — C# Project Scaffold and First Runnable Panel</w:t>
-      </w:r>
-    </w:p>
-    <w:bookmarkStart w:id="20" w:name="scaffold"/>
-    <w:p>
-      <w:pPr>
-        <w:pStyle w:val="Heading3"/>
-      </w:pPr>
-      <w:r>
         <w:t xml:space="preserve">5.1 — Scaffold</w:t>
       </w:r>
     </w:p>
@@ -2187,11 +2226,11 @@
         <w:t xml:space="preserve">from the sample’s csproj into ours.</w:t>
       </w:r>
     </w:p>
-    <w:bookmarkEnd w:id="20"/>
-    <w:bookmarkStart w:id="21" w:name="wire-the-db-connection"/>
-    <w:p>
-      <w:pPr>
-        <w:pStyle w:val="Heading3"/>
+    <w:bookmarkEnd w:id="24"/>
+    <w:bookmarkStart w:id="25" w:name="wire-the-db-connection"/>
+    <w:p>
+      <w:pPr>
+        <w:pStyle w:val="Heading2"/>
       </w:pPr>
       <w:r>
         <w:t xml:space="preserve">5.2 — Wire the DB connection</w:t>
@@ -2226,11 +2265,11 @@
         <w:t xml:space="preserve">. Match the sample’s pattern.</w:t>
       </w:r>
     </w:p>
-    <w:bookmarkEnd w:id="21"/>
-    <w:bookmarkStart w:id="22" w:name="generate-all-entity-classes"/>
-    <w:p>
-      <w:pPr>
-        <w:pStyle w:val="Heading3"/>
+    <w:bookmarkEnd w:id="25"/>
+    <w:bookmarkStart w:id="26" w:name="generate-all-entity-classes"/>
+    <w:p>
+      <w:pPr>
+        <w:pStyle w:val="Heading2"/>
       </w:pPr>
       <w:r>
         <w:t xml:space="preserve">5.3 — Generate all entity classes</w:t>
@@ -2369,21 +2408,21 @@
         <w:t xml:space="preserve">Do not invent fields. Do not invent SP names. If anything is unclear, ask before writing.</w:t>
       </w:r>
     </w:p>
-    <w:bookmarkEnd w:id="22"/>
-    <w:bookmarkStart w:id="23" w:name="review-entities-manual"/>
-    <w:p>
-      <w:pPr>
-        <w:pStyle w:val="Heading3"/>
+    <w:bookmarkEnd w:id="26"/>
+    <w:bookmarkStart w:id="27" w:name="review-entities-manual"/>
+    <w:p>
+      <w:pPr>
+        <w:pStyle w:val="Heading2"/>
       </w:pPr>
       <w:r>
         <w:t xml:space="preserve">5.4 — Review entities (manual)</w:t>
       </w:r>
     </w:p>
-    <w:bookmarkEnd w:id="23"/>
-    <w:bookmarkStart w:id="24" w:name="design-and-generate-the-entry-flow"/>
-    <w:p>
-      <w:pPr>
-        <w:pStyle w:val="Heading3"/>
+    <w:bookmarkEnd w:id="27"/>
+    <w:bookmarkStart w:id="28" w:name="design-and-generate-the-entry-flow"/>
+    <w:p>
+      <w:pPr>
+        <w:pStyle w:val="Heading2"/>
       </w:pPr>
       <w:r>
         <w:t xml:space="preserve">5.5 — Design and generate the entry flow</w:t>
@@ -2706,11 +2745,11 @@
         <w:t xml:space="preserve">documenting the design.</w:t>
       </w:r>
     </w:p>
-    <w:bookmarkEnd w:id="24"/>
-    <w:bookmarkStart w:id="25" w:name="generate-the-first-crud-panel"/>
-    <w:p>
-      <w:pPr>
-        <w:pStyle w:val="Heading3"/>
+    <w:bookmarkEnd w:id="28"/>
+    <w:bookmarkStart w:id="29" w:name="generate-the-first-crud-panel"/>
+    <w:p>
+      <w:pPr>
+        <w:pStyle w:val="Heading2"/>
       </w:pPr>
       <w:r>
         <w:t xml:space="preserve">5.6 — Generate the first CRUD panel</w:t>
@@ -2821,11 +2860,11 @@
         <w:t xml:space="preserve">Match the sample’s panel patterns: event-handler shape, return-to-home mechanism, Designer.cs structure.</w:t>
       </w:r>
     </w:p>
-    <w:bookmarkEnd w:id="25"/>
-    <w:bookmarkStart w:id="26" w:name="run"/>
-    <w:p>
-      <w:pPr>
-        <w:pStyle w:val="Heading3"/>
+    <w:bookmarkEnd w:id="29"/>
+    <w:bookmarkStart w:id="30" w:name="run"/>
+    <w:p>
+      <w:pPr>
+        <w:pStyle w:val="Heading2"/>
       </w:pPr>
       <w:r>
         <w:t xml:space="preserve">5.7 — Run</w:t>
@@ -2860,31 +2899,31 @@
         </w:pict>
       </w:r>
     </w:p>
-    <w:bookmarkEnd w:id="26"/>
-    <w:bookmarkEnd w:id="27"/>
-    <w:bookmarkStart w:id="30" w:name="phase-6-generate-remaining-cruds"/>
+    <w:bookmarkEnd w:id="30"/>
+    <w:bookmarkEnd w:id="31"/>
+    <w:bookmarkStart w:id="34" w:name="phase-6-generate-remaining-cruds"/>
+    <w:p>
+      <w:pPr>
+        <w:pStyle w:val="Heading1"/>
+      </w:pPr>
+      <w:r>
+        <w:t xml:space="preserve">Phase 6 — Generate Remaining CRUDs</w:t>
+      </w:r>
+    </w:p>
+    <w:p>
+      <w:pPr>
+        <w:pStyle w:val="FirstParagraph"/>
+      </w:pPr>
+      <w:r>
+        <w:t xml:space="preserve">Pick one path.</w:t>
+      </w:r>
+    </w:p>
+    <w:bookmarkStart w:id="32" w:name="option-a-one-at-a-time-cautious"/>
     <w:p>
       <w:pPr>
         <w:pStyle w:val="Heading2"/>
       </w:pPr>
       <w:r>
-        <w:t xml:space="preserve">Phase 6 — Generate Remaining CRUDs</w:t>
-      </w:r>
-    </w:p>
-    <w:p>
-      <w:pPr>
-        <w:pStyle w:val="FirstParagraph"/>
-      </w:pPr>
-      <w:r>
-        <w:t xml:space="preserve">Pick one path.</w:t>
-      </w:r>
-    </w:p>
-    <w:bookmarkStart w:id="28" w:name="option-a-one-at-a-time-cautious"/>
-    <w:p>
-      <w:pPr>
-        <w:pStyle w:val="Heading3"/>
-      </w:pPr>
-      <w:r>
         <w:t xml:space="preserve">Option A — One at a time (cautious)</w:t>
       </w:r>
     </w:p>
@@ -2950,11 +2989,11 @@
         <w:t xml:space="preserve">(replacing the TODO placeholder). Match the entity pattern, RTL settings, and Hebrew labels from existing panels.</w:t>
       </w:r>
     </w:p>
-    <w:bookmarkEnd w:id="28"/>
-    <w:bookmarkStart w:id="29" w:name="option-b-all-at-once-the-wow-path"/>
-    <w:p>
-      <w:pPr>
-        <w:pStyle w:val="Heading3"/>
+    <w:bookmarkEnd w:id="32"/>
+    <w:bookmarkStart w:id="33" w:name="option-b-all-at-once-the-wow-path"/>
+    <w:p>
+      <w:pPr>
+        <w:pStyle w:val="Heading2"/>
       </w:pPr>
       <w:r>
         <w:t xml:space="preserve">Option B — All at once (the wow path)</w:t>
@@ -3054,23 +3093,23 @@
         </w:pict>
       </w:r>
     </w:p>
-    <w:bookmarkEnd w:id="29"/>
-    <w:bookmarkEnd w:id="30"/>
-    <w:bookmarkStart w:id="34" w:name="X9e737ee9fc8291593325bce860e4b0d312a6aac"/>
+    <w:bookmarkEnd w:id="33"/>
+    <w:bookmarkEnd w:id="34"/>
+    <w:bookmarkStart w:id="38" w:name="X9e737ee9fc8291593325bce860e4b0d312a6aac"/>
+    <w:p>
+      <w:pPr>
+        <w:pStyle w:val="Heading1"/>
+      </w:pPr>
+      <w:r>
+        <w:t xml:space="preserve">Phase 7 — State Machines (in class if time permits, otherwise homework)</w:t>
+      </w:r>
+    </w:p>
+    <w:bookmarkStart w:id="35" w:name="identify-state-bearing-entities"/>
     <w:p>
       <w:pPr>
         <w:pStyle w:val="Heading2"/>
       </w:pPr>
       <w:r>
-        <w:t xml:space="preserve">Phase 7 — State Machines (in class if time permits, otherwise homework)</w:t>
-      </w:r>
-    </w:p>
-    <w:bookmarkStart w:id="31" w:name="identify-state-bearing-entities"/>
-    <w:p>
-      <w:pPr>
-        <w:pStyle w:val="Heading3"/>
-      </w:pPr>
-      <w:r>
         <w:t xml:space="preserve">7.1 — Identify state-bearing entities</w:t>
       </w:r>
     </w:p>
@@ -3097,11 +3136,11 @@
         <w:t xml:space="preserve">and any other state diagrams. For each entity with a non-trivial state machine, list: the entity, every state, every transition (source, target, trigger, guard, side effects in other entities). Do not implement anything yet — produce the inventory and ask for confirmation.</w:t>
       </w:r>
     </w:p>
-    <w:bookmarkEnd w:id="31"/>
-    <w:bookmarkStart w:id="32" w:name="generate-transition-methods-sps"/>
-    <w:p>
-      <w:pPr>
-        <w:pStyle w:val="Heading3"/>
+    <w:bookmarkEnd w:id="35"/>
+    <w:bookmarkStart w:id="36" w:name="generate-transition-methods-sps"/>
+    <w:p>
+      <w:pPr>
+        <w:pStyle w:val="Heading2"/>
       </w:pPr>
       <w:r>
         <w:t xml:space="preserve">7.3 — Generate transition methods + SPs</w:t>
@@ -3283,11 +3322,11 @@
         <w:t xml:space="preserve">Do not change any existing CRUD methods.</w:t>
       </w:r>
     </w:p>
-    <w:bookmarkEnd w:id="32"/>
-    <w:bookmarkStart w:id="33" w:name="verb-buttons"/>
-    <w:p>
-      <w:pPr>
-        <w:pStyle w:val="Heading3"/>
+    <w:bookmarkEnd w:id="36"/>
+    <w:bookmarkStart w:id="37" w:name="verb-buttons"/>
+    <w:p>
+      <w:pPr>
+        <w:pStyle w:val="Heading2"/>
       </w:pPr>
       <w:r>
         <w:t xml:space="preserve">7.5 — Verb buttons</w:t>
@@ -3320,12 +3359,12 @@
         </w:pict>
       </w:r>
     </w:p>
-    <w:bookmarkEnd w:id="33"/>
-    <w:bookmarkEnd w:id="34"/>
-    <w:bookmarkStart w:id="35" w:name="phases-811-homework"/>
-    <w:p>
-      <w:pPr>
-        <w:pStyle w:val="Heading2"/>
+    <w:bookmarkEnd w:id="37"/>
+    <w:bookmarkEnd w:id="38"/>
+    <w:bookmarkStart w:id="39" w:name="phases-811-homework"/>
+    <w:p>
+      <w:pPr>
+        <w:pStyle w:val="Heading1"/>
       </w:pPr>
       <w:r>
         <w:t xml:space="preserve">Phases 8–11 — Homework</w:t>
@@ -3354,8 +3393,7 @@
         <w:t xml:space="preserve">(Phases 8 through 11). Each follows the same paste-prompt-then-review pattern.</w:t>
       </w:r>
     </w:p>
-    <w:bookmarkEnd w:id="35"/>
-    <w:bookmarkEnd w:id="36"/>
+    <w:bookmarkEnd w:id="39"/>
     <w:sectPr>
       <w:footnotePr>
         <w:numRestart w:val="eachSect"/>
@@ -3913,6 +3951,7 @@
     <w:qFormat/>
     <w:rsid w:val="00A10FD9"/>
     <w:pPr>
+      <w:pageBreakBefore/>
       <w:keepNext/>
       <w:keepLines/>
       <w:spacing w:after="80" w:before="360"/>
@@ -4381,6 +4420,13 @@
       <w:bCs w:val="0"/>
       <w:color w:themeColor="accent1" w:themeShade="BF" w:val="365F91"/>
     </w:rPr>
+  </w:style>
+  <w:style w:styleId="Centered" w:type="paragraph">
+    <w:name w:val="Centered"/>
+    <w:basedOn w:val="Normal"/>
+    <w:pPr>
+      <w:jc w:val="center"/>
+    </w:pPr>
   </w:style>
   <w:style w:type="paragraph" w:customStyle="1" w:styleId="SourceCode">
     <w:name w:val="Source Code"/>

</xml_diff>